<commit_message>
Fix ECI: abstract/Table 1 Bonferroni contradiction, overclaimed WEI Granger-causality resolution, add WEI/electric-utility-output circularity disclosure
</commit_message>
<xml_diff>
--- a/ECI_FINAL.docx
+++ b/ECI_FINAL.docx
@@ -114,11 +114,9 @@
       <w:r>
         <w:rPr>
           <w:rFonts w:ascii="Times New Roman" w:hAnsi="Times New Roman"/>
-          <w:b w:val="0"/>
-          <w:i w:val="0"/>
           <w:sz w:val="22"/>
         </w:rPr>
-        <w:t>First, financialized crypto activity — DeFi deposits and stablecoin supply, increasingly treated as an informal signal of digital-economy health — does not track real economic activity. Tested against U.S. and international industrial output and a purpose-built weekly activity index, with a full multiple-testing correction applied across 44 specifications, the relationship is not distinguishable from noise, converging with an independent finding in recent peer-reviewed literature. One narrower relationship survives every check: stablecoin supply tracks broad money-supply (M2) growth (β = 24.8–29.3, p &lt; .0001 in both sub-periods tested) — a liquidity signal, not a growth signal.</w:t>
+        <w:t>First, financialized crypto activity — DeFi deposits and stablecoin supply, increasingly treated as an informal signal of digital-economy health — does not track real economic activity. Tested against U.S. and international industrial output and a purpose-built weekly activity index, with a full multiple-testing correction applied across 44 specifications, the relationship is not distinguishable from noise, converging with an independent finding in recent peer-reviewed literature. One narrower relationship holds across both sub-periods tested, though not uniformly under correction: stablecoin supply tracks broad money-supply (M2) growth in 2020–2022 (β = 24.8, p = .0022) and in 2023–2026 (β = 9.1, p &lt; .0001), with only the later period surviving Bonferroni correction — a liquidity signal, not a growth signal.</w:t>
       </w:r>
     </w:p>
     <w:p>
@@ -259,11 +257,9 @@
       <w:r>
         <w:rPr>
           <w:rFonts w:ascii="Times New Roman" w:hAnsi="Times New Roman"/>
-          <w:b w:val="0"/>
-          <w:i w:val="0"/>
           <w:sz w:val="24"/>
         </w:rPr>
-        <w:t>Second, it resolves, for the first time in this form, the direction of the (real) relationship between electricity generation and economic activity: coincident-to-lagging, not leading.</w:t>
+        <w:t>Second, it examines the direction of the (real) relationship between electricity generation and economic activity: coincident-to-lagging, not leading.</w:t>
       </w:r>
     </w:p>
     <w:p>
@@ -1352,7 +1348,9 @@
             <w:tcW w:type="dxa" w:w="2340"/>
           </w:tcPr>
           <w:p>
-            <w:r/>
+            <w:r>
+              <w:t>no</w:t>
+            </w:r>
             <w:r>
               <w:rPr>
                 <w:rFonts w:ascii="Times New Roman" w:hAnsi="Times New Roman"/>
@@ -1518,11 +1516,9 @@
       <w:r>
         <w:rPr>
           <w:rFonts w:ascii="Times New Roman" w:hAnsi="Times New Roman"/>
-          <w:b w:val="0"/>
-          <w:i w:val="0"/>
           <w:sz w:val="24"/>
         </w:rPr>
-        <w:t>Across 44 specifications run in total (including sub-period splits and placebo checks, reported in full in the appendix), a Bonferroni correction leaves only the OECD-benchmark and M2 relationships standing. The DeFi–industrial-production relationship, where nominally significant, is concentrated entirely in 2020–2022 (p = .057) and disappears in 2023–2026 (p = .525) — consistent with a single historical episode (pandemic stimulus flowing simultaneously into industrial recovery and crypto speculation) rather than a stable relationship. A stationarity-corrected Granger causality test finds significance in both directions simultaneously at every lag tested, which is itself diagnostic of a confounded rather than genuinely bidirectional relationship, and is reported as unresolved rather than interpreted further.</w:t>
+        <w:t>Across 44 specifications run in total (including sub-period splits and placebo checks, reported in full in the appendix), a Bonferroni correction leaves standing only the OECD-benchmark relationship and the 2023–2026 stablecoin–M2 relationship; the 2020–2022 stablecoin–M2 estimate (p = .0022) is nominally significant but does not clear the corrected threshold, though it points in the same direction as the period that does. The DeFi–industrial-production relationship, where nominally significant, is concentrated entirely in 2020–2022 (p = .057) and disappears in 2023–2026 (p = .525) — consistent with a single historical episode (pandemic stimulus flowing simultaneously into industrial recovery and crypto speculation) rather than a stable relationship. A stationarity-corrected Granger causality test finds significance in both directions simultaneously at every lag tested, which is itself diagnostic of a confounded rather than genuinely bidirectional relationship, and is reported as unresolved rather than interpreted further.</w:t>
       </w:r>
     </w:p>
     <w:p>
@@ -1532,11 +1528,9 @@
       <w:r>
         <w:rPr>
           <w:rFonts w:ascii="Times New Roman" w:hAnsi="Times New Roman"/>
-          <w:b w:val="0"/>
-          <w:i w:val="0"/>
           <w:sz w:val="24"/>
         </w:rPr>
-        <w:t>Stablecoin supply's relationship with M2 survives every check applied, in both sub-periods independently. This is mechanistically expected — stablecoins are dollar-backed instruments, so their supply is a visible slice of the same liquidity M2 measures — but had not been quantified this precisely before.</w:t>
+        <w:t>Stablecoin supply's relationship with M2 holds in both sub-periods tested, though only the 2023–2026 estimate survives Bonferroni correction. This is mechanistically expected — stablecoins are dollar-backed instruments, so their supply is a visible slice of the same liquidity M2 measures — but had not been quantified this precisely before.</w:t>
       </w:r>
     </w:p>
     <w:p>
@@ -1593,6 +1587,15 @@
           <w:sz w:val="25"/>
         </w:rPr>
         <w:t>4.1 Data and Sourcing</w:t>
+      </w:r>
+    </w:p>
+    <w:p>
+      <w:r>
+        <w:rPr>
+          <w:rFonts w:ascii="Times New Roman" w:hAnsi="Times New Roman"/>
+          <w:sz w:val="24"/>
+        </w:rPr>
+        <w:t>The Weekly Economic Index itself includes U.S. electric-utility output as one of its ten component series, so part of this relationship is mechanical rather than a fully independent confirmation; the Granger-causality result should be read with that overlap in mind rather than as evidence from two fully separate measures.</w:t>
       </w:r>
     </w:p>
     <w:p>

</xml_diff>

<commit_message>
ECI recovery search: full Taiwan semiconductor data recovered and verified line-by-line against source; Figure 3 error found and fixed; crypto/Granger analysis confirmed unrecoverable from this machine
</commit_message>
<xml_diff>
--- a/ECI_FINAL.docx
+++ b/ECI_FINAL.docx
@@ -1973,8 +1973,8 @@
       <w:r>
         <w:drawing>
           <wp:inline xmlns:a="http://schemas.openxmlformats.org/drawingml/2006/main" xmlns:pic="http://schemas.openxmlformats.org/drawingml/2006/picture">
-            <wp:extent cx="5669280" cy="3316069"/>
-            <wp:docPr id="3" name="Picture 3"/>
+            <wp:extent cx="5394960" cy="3283889"/>
+            <wp:docPr id="5" name="Picture 5"/>
             <wp:cNvGraphicFramePr>
               <a:graphicFrameLocks noChangeAspect="1"/>
             </wp:cNvGraphicFramePr>
@@ -1982,11 +1982,11 @@
               <a:graphicData uri="http://schemas.openxmlformats.org/drawingml/2006/picture">
                 <pic:pic>
                   <pic:nvPicPr>
-                    <pic:cNvPr id="0" name="fig1_taiwan_semiconductor_share.png"/>
+                    <pic:cNvPr id="0" name="fig3_corrected.png"/>
                     <pic:cNvPicPr/>
                   </pic:nvPicPr>
                   <pic:blipFill>
-                    <a:blip r:embed="rId11"/>
+                    <a:blip r:embed="rId13"/>
                     <a:stretch>
                       <a:fillRect/>
                     </a:stretch>
@@ -1994,7 +1994,7 @@
                   <pic:spPr>
                     <a:xfrm>
                       <a:off x="0" y="0"/>
-                      <a:ext cx="5669280" cy="3316069"/>
+                      <a:ext cx="5394960" cy="3283889"/>
                     </a:xfrm>
                     <a:prstGeom prst="rect"/>
                   </pic:spPr>

</xml_diff>